<commit_message>
feat: add Projects section component and include professional resume document
</commit_message>
<xml_diff>
--- a/public/Eminioluwa_Akinrinade_Resume.docx
+++ b/public/Eminioluwa_Akinrinade_Resume.docx
@@ -862,6 +862,10 @@
           </w:tcPr>
           <w:p>
             <w:pPr>
+              <w:numPr>
+                <w:numId w:val="0"/>
+              </w:numPr>
+              <w:ind w:leftChars="0"/>
               <w:rPr>
                 <w:color w:val="000000" w:themeColor="text1"/>
                 <w14:textFill>
@@ -887,6 +891,10 @@
           </w:p>
           <w:p>
             <w:pPr>
+              <w:numPr>
+                <w:numId w:val="0"/>
+              </w:numPr>
+              <w:ind w:leftChars="0"/>
               <w:rPr>
                 <w:color w:val="000000" w:themeColor="text1"/>
                 <w14:textFill>
@@ -912,6 +920,10 @@
           </w:p>
           <w:p>
             <w:pPr>
+              <w:numPr>
+                <w:numId w:val="0"/>
+              </w:numPr>
+              <w:ind w:leftChars="0"/>
               <w:rPr>
                 <w:color w:val="000000" w:themeColor="text1"/>
                 <w14:textFill>
@@ -937,8 +949,14 @@
           </w:p>
           <w:p>
             <w:pPr>
-              <w:rPr>
-                <w:color w:val="000000" w:themeColor="text1"/>
+              <w:numPr>
+                <w:numId w:val="0"/>
+              </w:numPr>
+              <w:ind w:leftChars="0"/>
+              <w:rPr>
+                <w:rFonts w:hint="default"/>
+                <w:color w:val="000000" w:themeColor="text1"/>
+                <w:lang w:val="en-US"/>
                 <w14:textFill>
                   <w14:solidFill>
                     <w14:schemeClr w14:val="tx1"/>
@@ -957,11 +975,30 @@
                   </w14:solidFill>
                 </w14:textFill>
               </w:rPr>
-              <w:t>• GraphQL</w:t>
+              <w:t xml:space="preserve">• </w:t>
+            </w:r>
+            <w:r>
+              <w:rPr>
+                <w:rFonts w:hint="default"/>
+                <w:color w:val="000000" w:themeColor="text1"/>
+                <w:sz w:val="20"/>
+                <w:szCs w:val="20"/>
+                <w:lang w:val="en-US"/>
+                <w14:textFill>
+                  <w14:solidFill>
+                    <w14:schemeClr w14:val="tx1"/>
+                  </w14:solidFill>
+                </w14:textFill>
+              </w:rPr>
+              <w:t>SpringBoot</w:t>
             </w:r>
           </w:p>
           <w:p>
             <w:pPr>
+              <w:numPr>
+                <w:numId w:val="0"/>
+              </w:numPr>
+              <w:ind w:leftChars="0"/>
               <w:rPr>
                 <w:color w:val="000000" w:themeColor="text1"/>
                 <w14:textFill>
@@ -982,11 +1019,43 @@
                   </w14:solidFill>
                 </w14:textFill>
               </w:rPr>
-              <w:t>• MySQL</w:t>
+              <w:t xml:space="preserve">• </w:t>
+            </w:r>
+            <w:r>
+              <w:rPr>
+                <w:rFonts w:hint="default"/>
+                <w:color w:val="000000" w:themeColor="text1"/>
+                <w:sz w:val="20"/>
+                <w:szCs w:val="20"/>
+                <w:lang w:val="en-US"/>
+                <w14:textFill>
+                  <w14:solidFill>
+                    <w14:schemeClr w14:val="tx1"/>
+                  </w14:solidFill>
+                </w14:textFill>
+              </w:rPr>
+              <w:t>Postgres</w:t>
+            </w:r>
+            <w:r>
+              <w:rPr>
+                <w:color w:val="000000" w:themeColor="text1"/>
+                <w:sz w:val="20"/>
+                <w:szCs w:val="20"/>
+                <w14:textFill>
+                  <w14:solidFill>
+                    <w14:schemeClr w14:val="tx1"/>
+                  </w14:solidFill>
+                </w14:textFill>
+              </w:rPr>
+              <w:t>SQL</w:t>
             </w:r>
           </w:p>
           <w:p>
             <w:pPr>
+              <w:numPr>
+                <w:numId w:val="0"/>
+              </w:numPr>
+              <w:ind w:leftChars="0"/>
               <w:rPr>
                 <w:color w:val="000000" w:themeColor="text1"/>
                 <w14:textFill>
@@ -1012,6 +1081,10 @@
           </w:p>
           <w:p>
             <w:pPr>
+              <w:numPr>
+                <w:numId w:val="0"/>
+              </w:numPr>
+              <w:ind w:leftChars="0"/>
               <w:rPr>
                 <w:rFonts w:hint="default"/>
                 <w:color w:val="000000" w:themeColor="text1"/>
@@ -1053,11 +1126,13 @@
               </w:rPr>
               <w:t>ython</w:t>
             </w:r>
-            <w:bookmarkStart w:id="0" w:name="_GoBack"/>
-            <w:bookmarkEnd w:id="0"/>
           </w:p>
           <w:p>
             <w:pPr>
+              <w:numPr>
+                <w:numId w:val="0"/>
+              </w:numPr>
+              <w:ind w:leftChars="0"/>
               <w:rPr>
                 <w:rFonts w:hint="default"/>
                 <w:color w:val="000000" w:themeColor="text1"/>
@@ -1799,7 +1874,63 @@
             </w14:solidFill>
           </w14:textFill>
         </w:rPr>
-        <w:t xml:space="preserve"> | React, Next.js, Node.js, MongoDB, Claude AI</w:t>
+        <w:t xml:space="preserve"> | React, Next.js, Node.js, </w:t>
+      </w:r>
+      <w:r>
+        <w:rPr>
+          <w:rFonts w:hint="default"/>
+          <w:color w:val="000000" w:themeColor="text1"/>
+          <w:sz w:val="20"/>
+          <w:szCs w:val="20"/>
+          <w:lang w:val="en-US"/>
+          <w14:textFill>
+            <w14:solidFill>
+              <w14:schemeClr w14:val="tx1"/>
+            </w14:solidFill>
+          </w14:textFill>
+        </w:rPr>
+        <w:t>Neon db</w:t>
+      </w:r>
+      <w:r>
+        <w:rPr>
+          <w:color w:val="000000" w:themeColor="text1"/>
+          <w:sz w:val="20"/>
+          <w:szCs w:val="20"/>
+          <w14:textFill>
+            <w14:solidFill>
+              <w14:schemeClr w14:val="tx1"/>
+            </w14:solidFill>
+          </w14:textFill>
+        </w:rPr>
+        <w:t xml:space="preserve">, </w:t>
+      </w:r>
+      <w:r>
+        <w:rPr>
+          <w:rFonts w:hint="default"/>
+          <w:color w:val="000000" w:themeColor="text1"/>
+          <w:sz w:val="20"/>
+          <w:szCs w:val="20"/>
+          <w:lang w:val="en-US"/>
+          <w14:textFill>
+            <w14:solidFill>
+              <w14:schemeClr w14:val="tx1"/>
+            </w14:solidFill>
+          </w14:textFill>
+        </w:rPr>
+        <w:t xml:space="preserve">Gemini </w:t>
+      </w:r>
+      <w:r>
+        <w:rPr>
+          <w:color w:val="000000" w:themeColor="text1"/>
+          <w:sz w:val="20"/>
+          <w:szCs w:val="20"/>
+          <w14:textFill>
+            <w14:solidFill>
+              <w14:schemeClr w14:val="tx1"/>
+            </w14:solidFill>
+          </w14:textFill>
+        </w:rPr>
+        <w:t xml:space="preserve"> AI</w:t>
       </w:r>
     </w:p>
     <w:p>
@@ -1899,31 +2030,151 @@
       <w:pPr>
         <w:spacing w:after="60"/>
         <w:rPr>
-          <w:color w:val="000000" w:themeColor="text1"/>
-          <w14:textFill>
-            <w14:solidFill>
-              <w14:schemeClr w14:val="tx1"/>
-            </w14:solidFill>
-          </w14:textFill>
-        </w:rPr>
-      </w:pPr>
-      <w:r>
-        <w:rPr>
+          <w:b w:val="0"/>
+          <w:bCs w:val="0"/>
+          <w:color w:val="000000" w:themeColor="text1"/>
+          <w:sz w:val="24"/>
+          <w:szCs w:val="24"/>
+          <w14:textFill>
+            <w14:solidFill>
+              <w14:schemeClr w14:val="tx1"/>
+            </w14:solidFill>
+          </w14:textFill>
+        </w:rPr>
+      </w:pPr>
+      <w:r>
+        <w:rPr>
+          <w:rFonts w:hint="default"/>
           <w:b/>
           <w:bCs/>
           <w:color w:val="000000" w:themeColor="text1"/>
           <w:sz w:val="24"/>
           <w:szCs w:val="24"/>
-          <w14:textFill>
-            <w14:solidFill>
-              <w14:schemeClr w14:val="tx1"/>
-            </w14:solidFill>
-          </w14:textFill>
-        </w:rPr>
-        <w:t>Enterprise Payroll Management System</w:t>
-      </w:r>
-      <w:r>
-        <w:rPr>
+          <w:lang w:val="en-US"/>
+          <w14:textFill>
+            <w14:solidFill>
+              <w14:schemeClr w14:val="tx1"/>
+            </w14:solidFill>
+          </w14:textFill>
+        </w:rPr>
+        <w:t>Africquehub</w:t>
+      </w:r>
+      <w:r>
+        <w:rPr>
+          <w:b/>
+          <w:bCs/>
+          <w:color w:val="000000" w:themeColor="text1"/>
+          <w:sz w:val="24"/>
+          <w:szCs w:val="24"/>
+          <w14:textFill>
+            <w14:solidFill>
+              <w14:schemeClr w14:val="tx1"/>
+            </w14:solidFill>
+          </w14:textFill>
+        </w:rPr>
+        <w:t xml:space="preserve"> |</w:t>
+      </w:r>
+      <w:r>
+        <w:rPr>
+          <w:b w:val="0"/>
+          <w:bCs w:val="0"/>
+          <w:color w:val="000000" w:themeColor="text1"/>
+          <w:sz w:val="24"/>
+          <w:szCs w:val="24"/>
+          <w14:textFill>
+            <w14:solidFill>
+              <w14:schemeClr w14:val="tx1"/>
+            </w14:solidFill>
+          </w14:textFill>
+        </w:rPr>
+        <w:t>React, Next.js, Node.js, MongoDB</w:t>
+      </w:r>
+    </w:p>
+    <w:p>
+      <w:pPr>
+        <w:keepNext w:val="0"/>
+        <w:keepLines w:val="0"/>
+        <w:widowControl/>
+        <w:suppressLineNumbers w:val="0"/>
+        <w:ind w:left="658" w:leftChars="200" w:hanging="218" w:hangingChars="91"/>
+      </w:pPr>
+      <w:r>
+        <w:rPr>
+          <w:rFonts w:ascii="Symbol" w:hAnsi="Symbol" w:eastAsia="Symbol" w:cs="Symbol"/>
+          <w:sz w:val="24"/>
+        </w:rPr>
+        <w:t>·</w:t>
+      </w:r>
+      <w:r>
+        <w:rPr>
+          <w:rFonts w:hint="eastAsia" w:ascii="SimSun" w:hAnsi="SimSun" w:eastAsia="SimSun" w:cs="SimSun"/>
+          <w:sz w:val="24"/>
+        </w:rPr>
+        <w:t xml:space="preserve">  </w:t>
+      </w:r>
+      <w:r>
+        <w:t xml:space="preserve">Built a full-stack e-commerce platform featuring product catalog, shopping cart, Stripe payment integration, user authentication, and admin dashboard. </w:t>
+      </w:r>
+    </w:p>
+    <w:p>
+      <w:pPr>
+        <w:keepNext w:val="0"/>
+        <w:keepLines w:val="0"/>
+        <w:widowControl/>
+        <w:suppressLineNumbers w:val="0"/>
+        <w:ind w:left="658" w:leftChars="200" w:hanging="218" w:hangingChars="91"/>
+      </w:pPr>
+      <w:r>
+        <w:rPr>
+          <w:rFonts w:hint="default" w:ascii="Symbol" w:hAnsi="Symbol" w:eastAsia="Symbol" w:cs="Symbol"/>
+          <w:sz w:val="24"/>
+        </w:rPr>
+        <w:t>·</w:t>
+      </w:r>
+      <w:r>
+        <w:rPr>
+          <w:rFonts w:hint="eastAsia" w:ascii="SimSun" w:hAnsi="SimSun" w:eastAsia="SimSun" w:cs="SimSun"/>
+          <w:sz w:val="24"/>
+        </w:rPr>
+        <w:t xml:space="preserve">  </w:t>
+      </w:r>
+      <w:r>
+        <w:t xml:space="preserve">Implemented SEO optimization, server-side rendering, and internationalization support to improve visibility and global accessibility. </w:t>
+      </w:r>
+    </w:p>
+    <w:p>
+      <w:pPr>
+        <w:keepNext w:val="0"/>
+        <w:keepLines w:val="0"/>
+        <w:widowControl/>
+        <w:suppressLineNumbers w:val="0"/>
+        <w:ind w:left="658" w:leftChars="200" w:hanging="218" w:hangingChars="91"/>
+      </w:pPr>
+      <w:r>
+        <w:rPr>
+          <w:rFonts w:hint="default" w:ascii="Symbol" w:hAnsi="Symbol" w:eastAsia="Symbol" w:cs="Symbol"/>
+          <w:sz w:val="24"/>
+        </w:rPr>
+        <w:t>·</w:t>
+      </w:r>
+      <w:r>
+        <w:rPr>
+          <w:rFonts w:hint="eastAsia" w:ascii="SimSun" w:hAnsi="SimSun" w:eastAsia="SimSun" w:cs="SimSun"/>
+          <w:sz w:val="24"/>
+        </w:rPr>
+        <w:t xml:space="preserve">  </w:t>
+      </w:r>
+      <w:r>
+        <w:t>Developed scalable REST APIs and MongoDB database architecture for product, order, and customer management.</w:t>
+      </w:r>
+    </w:p>
+    <w:p>
+      <w:pPr>
+        <w:spacing w:after="60"/>
+        <w:ind w:left="660" w:leftChars="300" w:firstLine="0" w:firstLineChars="0"/>
+        <w:rPr>
+          <w:b w:val="0"/>
+          <w:bCs w:val="0"/>
           <w:color w:val="000000" w:themeColor="text1"/>
           <w:sz w:val="20"/>
           <w:szCs w:val="20"/>
@@ -1933,7 +2184,107 @@
             </w14:solidFill>
           </w14:textFill>
         </w:rPr>
-        <w:t xml:space="preserve"> | PHP, MySQL, React, PDF Generation</w:t>
+      </w:pPr>
+    </w:p>
+    <w:p>
+      <w:pPr>
+        <w:spacing w:after="60"/>
+        <w:rPr>
+          <w:color w:val="000000" w:themeColor="text1"/>
+          <w14:textFill>
+            <w14:solidFill>
+              <w14:schemeClr w14:val="tx1"/>
+            </w14:solidFill>
+          </w14:textFill>
+        </w:rPr>
+      </w:pPr>
+      <w:r>
+        <w:rPr>
+          <w:b/>
+          <w:bCs/>
+          <w:color w:val="000000" w:themeColor="text1"/>
+          <w:sz w:val="24"/>
+          <w:szCs w:val="24"/>
+          <w14:textFill>
+            <w14:solidFill>
+              <w14:schemeClr w14:val="tx1"/>
+            </w14:solidFill>
+          </w14:textFill>
+        </w:rPr>
+        <w:t xml:space="preserve">Student </w:t>
+      </w:r>
+      <w:r>
+        <w:rPr>
+          <w:rFonts w:hint="default"/>
+          <w:b/>
+          <w:bCs/>
+          <w:color w:val="000000" w:themeColor="text1"/>
+          <w:sz w:val="24"/>
+          <w:szCs w:val="24"/>
+          <w:lang w:val="en-US"/>
+          <w14:textFill>
+            <w14:solidFill>
+              <w14:schemeClr w14:val="tx1"/>
+            </w14:solidFill>
+          </w14:textFill>
+        </w:rPr>
+        <w:t xml:space="preserve"> Attendance </w:t>
+      </w:r>
+      <w:r>
+        <w:rPr>
+          <w:b/>
+          <w:bCs/>
+          <w:color w:val="000000" w:themeColor="text1"/>
+          <w:sz w:val="24"/>
+          <w:szCs w:val="24"/>
+          <w14:textFill>
+            <w14:solidFill>
+              <w14:schemeClr w14:val="tx1"/>
+            </w14:solidFill>
+          </w14:textFill>
+        </w:rPr>
+        <w:t>Monitoring &amp; Analytics System</w:t>
+      </w:r>
+      <w:r>
+        <w:rPr>
+          <w:color w:val="000000" w:themeColor="text1"/>
+          <w:sz w:val="20"/>
+          <w:szCs w:val="20"/>
+          <w14:textFill>
+            <w14:solidFill>
+              <w14:schemeClr w14:val="tx1"/>
+            </w14:solidFill>
+          </w14:textFill>
+        </w:rPr>
+        <w:t xml:space="preserve"> | </w:t>
+      </w:r>
+      <w:r>
+        <w:rPr>
+          <w:rFonts w:hint="default"/>
+          <w:color w:val="000000" w:themeColor="text1"/>
+          <w:sz w:val="20"/>
+          <w:szCs w:val="20"/>
+          <w:lang w:val="en-US"/>
+          <w14:textFill>
+            <w14:solidFill>
+              <w14:schemeClr w14:val="tx1"/>
+            </w14:solidFill>
+          </w14:textFill>
+        </w:rPr>
+        <w:t>Node js</w:t>
+      </w:r>
+      <w:r>
+        <w:rPr>
+          <w:color w:val="000000" w:themeColor="text1"/>
+          <w:sz w:val="20"/>
+          <w:szCs w:val="20"/>
+          <w14:textFill>
+            <w14:solidFill>
+              <w14:schemeClr w14:val="tx1"/>
+            </w14:solidFill>
+          </w14:textFill>
+        </w:rPr>
+        <w:t>, MySQL, JavaScript, Data Visualization</w:t>
       </w:r>
     </w:p>
     <w:p>
@@ -1964,7 +2315,7 @@
             </w14:solidFill>
           </w14:textFill>
         </w:rPr>
-        <w:t>Built enterprise-grade payroll processing system for organizations with 100-500 employees, automating salary calculations, tax deductions, and benefits management with 99.99% accuracy</w:t>
+        <w:t>Engineered comprehensive student management system adopted by 5+ educational institutions, featuring real-time grade tracking, attendance monitoring, and parent communication portal</w:t>
       </w:r>
     </w:p>
     <w:p>
@@ -1995,7 +2346,22 @@
             </w14:solidFill>
           </w14:textFill>
         </w:rPr>
-        <w:t>Implemented advanced security protocols including role-based access control (RBAC), encrypted data storage, and audit logging to ensure compliance with data protection regulations</w:t>
+        <w:t>Optimi</w:t>
+      </w:r>
+      <w:bookmarkStart w:id="0" w:name="_GoBack"/>
+      <w:bookmarkEnd w:id="0"/>
+      <w:r>
+        <w:rPr>
+          <w:color w:val="000000" w:themeColor="text1"/>
+          <w:sz w:val="22"/>
+          <w:szCs w:val="22"/>
+          <w14:textFill>
+            <w14:solidFill>
+              <w14:schemeClr w14:val="tx1"/>
+            </w14:solidFill>
+          </w14:textFill>
+        </w:rPr>
+        <w:t>zed MySQL database queries and implemented caching strategies, improving report generation speed by 60% and supporting concurrent access for 500+ users</w:t>
       </w:r>
     </w:p>
     <w:p>
@@ -2023,7 +2389,7 @@
             </w14:solidFill>
           </w14:textFill>
         </w:rPr>
-        <w:t>Student Monitoring &amp; Analytics System</w:t>
+        <w:t>Cross-Platform Mobile Applications</w:t>
       </w:r>
       <w:r>
         <w:rPr>
@@ -2036,7 +2402,7 @@
             </w14:solidFill>
           </w14:textFill>
         </w:rPr>
-        <w:t xml:space="preserve"> | PHP, MySQL, JavaScript, Data Visualization</w:t>
+        <w:t xml:space="preserve"> | React Native, iOS/Android, Native Modules</w:t>
       </w:r>
     </w:p>
     <w:p>
@@ -2067,7 +2433,7 @@
             </w14:solidFill>
           </w14:textFill>
         </w:rPr>
-        <w:t>Engineered comprehensive student management system adopted by 5+ educational institutions, featuring real-time grade tracking, attendance monitoring, and parent communication portal</w:t>
+        <w:t>Developed 3+ cross-platform mobile applications for iOS and Android using React Native, integrating native modules for camera access, geolocation services, and push notifications</w:t>
       </w:r>
     </w:p>
     <w:p>
@@ -2077,7 +2443,7 @@
           <w:ilvl w:val="0"/>
           <w:numId w:val="1"/>
         </w:numPr>
-        <w:spacing w:after="120"/>
+        <w:spacing w:after="240"/>
         <w:rPr>
           <w:color w:val="000000" w:themeColor="text1"/>
           <w14:textFill>
@@ -2098,7 +2464,31 @@
             </w14:solidFill>
           </w14:textFill>
         </w:rPr>
-        <w:t>Optimized MySQL database queries and implemented caching strategies, improving report generation speed by 60% and supporting concurrent access for 500+ users</w:t>
+        <w:t>Successfully published apps to Google Play Store and Apple App Store, achieving 4.5+ star ratings and 5,000+ downloads with optimized battery consumption and offline functionality</w:t>
+      </w:r>
+    </w:p>
+    <w:p>
+      <w:pPr>
+        <w:pStyle w:val="2"/>
+        <w:rPr>
+          <w:color w:val="000000" w:themeColor="text1"/>
+          <w14:textFill>
+            <w14:solidFill>
+              <w14:schemeClr w14:val="tx1"/>
+            </w14:solidFill>
+          </w14:textFill>
+        </w:rPr>
+      </w:pPr>
+      <w:r>
+        <w:rPr>
+          <w:color w:val="000000" w:themeColor="text1"/>
+          <w14:textFill>
+            <w14:solidFill>
+              <w14:schemeClr w14:val="tx1"/>
+            </w14:solidFill>
+          </w14:textFill>
+        </w:rPr>
+        <w:t>EDUCATION</w:t>
       </w:r>
     </w:p>
     <w:p>
@@ -2126,20 +2516,33 @@
             </w14:solidFill>
           </w14:textFill>
         </w:rPr>
-        <w:t>Cross-Platform Mobile Applications</w:t>
-      </w:r>
-      <w:r>
-        <w:rPr>
-          <w:color w:val="000000" w:themeColor="text1"/>
-          <w:sz w:val="20"/>
-          <w:szCs w:val="20"/>
-          <w14:textFill>
-            <w14:solidFill>
-              <w14:schemeClr w14:val="tx1"/>
-            </w14:solidFill>
-          </w14:textFill>
-        </w:rPr>
-        <w:t xml:space="preserve"> | React Native, iOS/Android, Native Modules</w:t>
+        <w:t>Bachelor of Science in Computer Software Engineering</w:t>
+      </w:r>
+    </w:p>
+    <w:p>
+      <w:pPr>
+        <w:spacing w:after="60"/>
+        <w:rPr>
+          <w:color w:val="000000" w:themeColor="text1"/>
+          <w14:textFill>
+            <w14:solidFill>
+              <w14:schemeClr w14:val="tx1"/>
+            </w14:solidFill>
+          </w14:textFill>
+        </w:rPr>
+      </w:pPr>
+      <w:r>
+        <w:rPr>
+          <w:color w:val="000000" w:themeColor="text1"/>
+          <w:sz w:val="22"/>
+          <w:szCs w:val="22"/>
+          <w14:textFill>
+            <w14:solidFill>
+              <w14:schemeClr w14:val="tx1"/>
+            </w14:solidFill>
+          </w14:textFill>
+        </w:rPr>
+        <w:t>Babcock University, Ilishan-Remo, Nigeria • Expected Graduation: July 2026</w:t>
       </w:r>
     </w:p>
     <w:p>
@@ -2170,7 +2573,66 @@
             </w14:solidFill>
           </w14:textFill>
         </w:rPr>
-        <w:t>Developed 3+ cross-platform mobile applications for iOS and Android using React Native, integrating native modules for camera access, geolocation services, and push notifications</w:t>
+        <w:t>CGPA: 3.96/</w:t>
+      </w:r>
+      <w:r>
+        <w:rPr>
+          <w:rFonts w:hint="default"/>
+          <w:color w:val="000000" w:themeColor="text1"/>
+          <w:sz w:val="22"/>
+          <w:szCs w:val="22"/>
+          <w:lang w:val="en-US"/>
+          <w14:textFill>
+            <w14:solidFill>
+              <w14:schemeClr w14:val="tx1"/>
+            </w14:solidFill>
+          </w14:textFill>
+        </w:rPr>
+        <w:t>5</w:t>
+      </w:r>
+      <w:r>
+        <w:rPr>
+          <w:color w:val="000000" w:themeColor="text1"/>
+          <w:sz w:val="22"/>
+          <w:szCs w:val="22"/>
+          <w14:textFill>
+            <w14:solidFill>
+              <w14:schemeClr w14:val="tx1"/>
+            </w14:solidFill>
+          </w14:textFill>
+        </w:rPr>
+        <w:t>.0 (Second Class Upper Honours) – Dean's List Recognition</w:t>
+      </w:r>
+    </w:p>
+    <w:p>
+      <w:pPr>
+        <w:pStyle w:val="16"/>
+        <w:numPr>
+          <w:ilvl w:val="0"/>
+          <w:numId w:val="1"/>
+        </w:numPr>
+        <w:spacing w:after="80"/>
+        <w:rPr>
+          <w:color w:val="000000" w:themeColor="text1"/>
+          <w14:textFill>
+            <w14:solidFill>
+              <w14:schemeClr w14:val="tx1"/>
+            </w14:solidFill>
+          </w14:textFill>
+        </w:rPr>
+      </w:pPr>
+      <w:r>
+        <w:rPr>
+          <w:color w:val="000000" w:themeColor="text1"/>
+          <w:sz w:val="22"/>
+          <w:szCs w:val="22"/>
+          <w14:textFill>
+            <w14:solidFill>
+              <w14:schemeClr w14:val="tx1"/>
+            </w14:solidFill>
+          </w14:textFill>
+        </w:rPr>
+        <w:t>Relevant Coursework: Data Structures &amp; Algorithms, Software Engineering, Database Systems, Web Development, Mobile Application Development, Cloud Computing, Cybersecurity</w:t>
       </w:r>
     </w:p>
     <w:p>
@@ -2201,104 +2663,23 @@
             </w14:solidFill>
           </w14:textFill>
         </w:rPr>
-        <w:t>Successfully published apps to Google Play Store and Apple App Store, achieving 4.5+ star ratings and 5,000+ downloads with optimized battery consumption and offline functionality</w:t>
-      </w:r>
-    </w:p>
-    <w:p>
-      <w:pPr>
-        <w:pStyle w:val="2"/>
-        <w:rPr>
-          <w:color w:val="000000" w:themeColor="text1"/>
-          <w14:textFill>
-            <w14:solidFill>
-              <w14:schemeClr w14:val="tx1"/>
-            </w14:solidFill>
-          </w14:textFill>
-        </w:rPr>
-      </w:pPr>
-      <w:r>
-        <w:rPr>
-          <w:color w:val="000000" w:themeColor="text1"/>
-          <w14:textFill>
-            <w14:solidFill>
-              <w14:schemeClr w14:val="tx1"/>
-            </w14:solidFill>
-          </w14:textFill>
-        </w:rPr>
-        <w:t>EDUCATION</w:t>
-      </w:r>
-    </w:p>
-    <w:p>
-      <w:pPr>
-        <w:spacing w:after="60"/>
-        <w:rPr>
-          <w:color w:val="000000" w:themeColor="text1"/>
-          <w14:textFill>
-            <w14:solidFill>
-              <w14:schemeClr w14:val="tx1"/>
-            </w14:solidFill>
-          </w14:textFill>
-        </w:rPr>
-      </w:pPr>
-      <w:r>
-        <w:rPr>
-          <w:b/>
-          <w:bCs/>
-          <w:color w:val="000000" w:themeColor="text1"/>
-          <w:sz w:val="24"/>
-          <w:szCs w:val="24"/>
-          <w14:textFill>
-            <w14:solidFill>
-              <w14:schemeClr w14:val="tx1"/>
-            </w14:solidFill>
-          </w14:textFill>
-        </w:rPr>
-        <w:t>Bachelor of Science in Computer Software Engineering</w:t>
-      </w:r>
-    </w:p>
-    <w:p>
-      <w:pPr>
-        <w:spacing w:after="60"/>
-        <w:rPr>
-          <w:color w:val="000000" w:themeColor="text1"/>
-          <w14:textFill>
-            <w14:solidFill>
-              <w14:schemeClr w14:val="tx1"/>
-            </w14:solidFill>
-          </w14:textFill>
-        </w:rPr>
-      </w:pPr>
-      <w:r>
-        <w:rPr>
+        <w:t>Active Member: BU</w:t>
+      </w:r>
+      <w:r>
+        <w:rPr>
+          <w:rFonts w:hint="default"/>
           <w:color w:val="000000" w:themeColor="text1"/>
           <w:sz w:val="22"/>
           <w:szCs w:val="22"/>
-          <w14:textFill>
-            <w14:solidFill>
-              <w14:schemeClr w14:val="tx1"/>
-            </w14:solidFill>
-          </w14:textFill>
-        </w:rPr>
-        <w:t>Babcock University, Ilishan-Remo, Nigeria • Expected Graduation: July 2026</w:t>
-      </w:r>
-    </w:p>
-    <w:p>
-      <w:pPr>
-        <w:pStyle w:val="16"/>
-        <w:numPr>
-          <w:ilvl w:val="0"/>
-          <w:numId w:val="1"/>
-        </w:numPr>
-        <w:spacing w:after="80"/>
-        <w:rPr>
-          <w:color w:val="000000" w:themeColor="text1"/>
-          <w14:textFill>
-            <w14:solidFill>
-              <w14:schemeClr w14:val="tx1"/>
-            </w14:solidFill>
-          </w14:textFill>
-        </w:rPr>
-      </w:pPr>
+          <w:lang w:val="en-US"/>
+          <w14:textFill>
+            <w14:solidFill>
+              <w14:schemeClr w14:val="tx1"/>
+            </w14:solidFill>
+          </w14:textFill>
+        </w:rPr>
+        <w:t xml:space="preserve">CC </w:t>
+      </w:r>
       <w:r>
         <w:rPr>
           <w:color w:val="000000" w:themeColor="text1"/>
@@ -2310,57 +2691,23 @@
             </w14:solidFill>
           </w14:textFill>
         </w:rPr>
-        <w:t>CGPA: 3.96/4.0 (Second Class Upper Honours) – Dean's List Recognition</w:t>
-      </w:r>
-    </w:p>
-    <w:p>
-      <w:pPr>
-        <w:pStyle w:val="16"/>
-        <w:numPr>
-          <w:ilvl w:val="0"/>
-          <w:numId w:val="1"/>
-        </w:numPr>
-        <w:spacing w:after="80"/>
-        <w:rPr>
-          <w:color w:val="000000" w:themeColor="text1"/>
-          <w14:textFill>
-            <w14:solidFill>
-              <w14:schemeClr w14:val="tx1"/>
-            </w14:solidFill>
-          </w14:textFill>
-        </w:rPr>
-      </w:pPr>
-      <w:r>
-        <w:rPr>
+        <w:t>(</w:t>
+      </w:r>
+      <w:r>
+        <w:rPr>
+          <w:rFonts w:hint="default"/>
           <w:color w:val="000000" w:themeColor="text1"/>
           <w:sz w:val="22"/>
           <w:szCs w:val="22"/>
-          <w14:textFill>
-            <w14:solidFill>
-              <w14:schemeClr w14:val="tx1"/>
-            </w14:solidFill>
-          </w14:textFill>
-        </w:rPr>
-        <w:t>Relevant Coursework: Data Structures &amp; Algorithms, Software Engineering, Database Systems, Web Development, Mobile Application Development, Cloud Computing, Cybersecurity</w:t>
-      </w:r>
-    </w:p>
-    <w:p>
-      <w:pPr>
-        <w:pStyle w:val="16"/>
-        <w:numPr>
-          <w:ilvl w:val="0"/>
-          <w:numId w:val="1"/>
-        </w:numPr>
-        <w:spacing w:after="240"/>
-        <w:rPr>
-          <w:color w:val="000000" w:themeColor="text1"/>
-          <w14:textFill>
-            <w14:solidFill>
-              <w14:schemeClr w14:val="tx1"/>
-            </w14:solidFill>
-          </w14:textFill>
-        </w:rPr>
-      </w:pPr>
+          <w:lang w:val="en-US"/>
+          <w14:textFill>
+            <w14:solidFill>
+              <w14:schemeClr w14:val="tx1"/>
+            </w14:solidFill>
+          </w14:textFill>
+        </w:rPr>
+        <w:t>Babcock University Computer</w:t>
+      </w:r>
       <w:r>
         <w:rPr>
           <w:color w:val="000000" w:themeColor="text1"/>
@@ -2372,7 +2719,7 @@
             </w14:solidFill>
           </w14:textFill>
         </w:rPr>
-        <w:t>Active Member: BU-SENG (Software Engineering Club) – Contributing to open-source projects and technical workshops</w:t>
+        <w:t xml:space="preserve"> Club) – Contributing to open-source projects and technical workshops</w:t>
       </w:r>
     </w:p>
     <w:p>
@@ -2827,7 +3174,7 @@
   <w:docDefaults>
     <w:rPrDefault>
       <w:rPr>
-        <w:rFonts w:ascii="Calibri" w:hAnsi="Calibri" w:eastAsia="Calibri" w:cs="Calibri"/>
+        <w:rFonts w:ascii="Times New Roman" w:hAnsi="Times New Roman" w:eastAsia="SimSun" w:cs="Times New Roman"/>
       </w:rPr>
     </w:rPrDefault>
     <w:pPrDefault/>

</xml_diff>